<commit_message>
feat: emoji shortcodes and frontmatter - Word document properties
</commit_message>
<xml_diff>
--- a/examples/example-1/sample.docx
+++ b/examples/example-1/sample.docx
@@ -2851,7 +2851,7 @@
       <w:r>
         <w:t xml:space="preserve">The </w:t>
       </w:r>
-      <w:hyperlink w:history="1" r:id="rIdtnl-3rqojzidswcqxtume">
+      <w:hyperlink w:history="1" r:id="rIdop6eyqyowep-ef0rmt6yv">
         <w:r>
           <w:rPr>
             <w:color w:val="2563EB"/>
@@ -2890,7 +2890,7 @@
       <w:r>
         <w:t xml:space="preserve">The Perfect Loaf keeps a deep sourdough archive at </w:t>
       </w:r>
-      <w:hyperlink w:history="1" r:id="rIdbeplrgtzwhaxul6dwrkpi">
+      <w:hyperlink w:history="1" r:id="rId_90tz9gfcng_flo6-4hjt">
         <w:r>
           <w:rPr>
             <w:color w:val="2563EB"/>
@@ -3009,7 +3009,10 @@
         <w:t xml:space="preserve">md2x</w:t>
       </w:r>
       <w:r>
-        <w:t xml:space="preserve">.</w:t>
+        <w:t xml:space="preserve">. </w:t>
+      </w:r>
+      <w:r>
+        <w:t xml:space="preserve">🍞</w:t>
       </w:r>
       <w:r>
         <w:br/>

</xml_diff>

<commit_message>
feat: docx support additional inline HTML tags
</commit_message>
<xml_diff>
--- a/examples/example-1/sample.docx
+++ b/examples/example-1/sample.docx
@@ -630,7 +630,45 @@
     </w:p>
     <w:p>
       <w:r>
-        <w:t xml:space="preserve">You need less equipment than most recipes imply, but the ingredients deserve care. Weigh them if you can — volume measurements for flour can vary by a third.</w:t>
+        <w:t xml:space="preserve">You need less equipment than most recipes imply, but the ingredients deserve care. Weigh them if you can — volume measurements for flour can vary by a third. For a digital workflow, set a timer and press </w:t>
+      </w:r>
+      <w:r>
+        <w:rPr>
+          <w:rFonts w:ascii="Consolas" w:cs="Consolas" w:eastAsia="Consolas" w:hAnsi="Consolas"/>
+          <w:sz w:val="20"/>
+          <w:szCs w:val="20"/>
+          <w:shd w:fill="F3F4F6" w:color="auto" w:val="clear"/>
+        </w:rPr>
+        <w:t xml:space="preserve">Start</w:t>
+      </w:r>
+      <w:r>
+        <w:t xml:space="preserve">. The formulas below use </w:t>
+      </w:r>
+      <w:r>
+        <w:rPr>
+          <w:u w:val="dotted"/>
+        </w:rPr>
+        <w:t xml:space="preserve">BP</w:t>
+      </w:r>
+      <w:r>
+        <w:t xml:space="preserve">; classic references such as </w:t>
+      </w:r>
+      <w:r>
+        <w:rPr>
+          <w:i/>
+          <w:iCs/>
+        </w:rPr>
+        <w:t xml:space="preserve">Tartine Bread</w:t>
+      </w:r>
+      <w:r>
+        <w:t xml:space="preserve"> use the same convention. </w:t>
+      </w:r>
+      <w:r>
+        <w:rPr>
+          <w:sz w:val="20"/>
+          <w:szCs w:val="20"/>
+        </w:rPr>
+        <w:t xml:space="preserve">All temperatures and timings in this guide are approximate.</w:t>
       </w:r>
     </w:p>
     <w:tbl>
@@ -2851,7 +2889,7 @@
       <w:r>
         <w:t xml:space="preserve">The </w:t>
       </w:r>
-      <w:hyperlink w:history="1" r:id="rIdop6eyqyowep-ef0rmt6yv">
+      <w:hyperlink w:history="1" r:id="rIdeqf5mwkzyw7vldjst52bq">
         <w:r>
           <w:rPr>
             <w:color w:val="2563EB"/>
@@ -2890,7 +2928,7 @@
       <w:r>
         <w:t xml:space="preserve">The Perfect Loaf keeps a deep sourdough archive at </w:t>
       </w:r>
-      <w:hyperlink w:history="1" r:id="rId_90tz9gfcng_flo6-4hjt">
+      <w:hyperlink w:history="1" r:id="rIdzuzrpoi_uq9uemzdfhef_">
         <w:r>
           <w:rPr>
             <w:color w:val="2563EB"/>

</xml_diff>